<commit_message>
auto: session 2026-10-08 09:52
Co-Authored-By: Claude Opus 4.8 (1M context) <noreply@anthropic.com>
</commit_message>
<xml_diff>
--- a/AP/Bài đăng báo/CafeBiz-AP-Vietnam-2026-10-08.docx
+++ b/AP/Bài đăng báo/CafeBiz-AP-Vietnam-2026-10-08.docx
@@ -2,6 +2,369 @@
 <file path=word/document.xml><?xml version="1.0" encoding="utf-8"?>
 <w:document xmlns:wpc="http://schemas.microsoft.com/office/word/2010/wordprocessingCanvas" xmlns:mo="http://schemas.microsoft.com/office/mac/office/2008/main" xmlns:mc="http://schemas.openxmlformats.org/markup-compatibility/2006" xmlns:mv="urn:schemas-microsoft-com:mac:vml" xmlns:o="urn:schemas-microsoft-com:office:office" xmlns:r="http://schemas.openxmlformats.org/officeDocument/2006/relationships" xmlns:m="http://schemas.openxmlformats.org/officeDocument/2006/math" xmlns:v="urn:schemas-microsoft-com:vml" xmlns:wp14="http://schemas.microsoft.com/office/word/2010/wordprocessingDrawing" xmlns:wp="http://schemas.openxmlformats.org/drawingml/2006/wordprocessingDrawing" xmlns:w10="urn:schemas-microsoft-com:office:word" xmlns:w="http://schemas.openxmlformats.org/wordprocessingml/2006/main" xmlns:w14="http://schemas.microsoft.com/office/word/2010/wordml" xmlns:wpg="http://schemas.microsoft.com/office/word/2010/wordprocessingGroup" xmlns:wpi="http://schemas.microsoft.com/office/word/2010/wordprocessingInk" xmlns:wne="http://schemas.microsoft.com/office/word/2006/wordml" xmlns:wps="http://schemas.microsoft.com/office/word/2010/wordprocessingShape" mc:Ignorable="w14 wp14">
   <w:body>
+    <w:p>
+      <w:r>
+        <w:rPr>
+          <w:rFonts w:ascii="Inter" w:hAnsi="Inter"/>
+          <w:b/>
+          <w:i w:val="0"/>
+          <w:sz w:val="21"/>
+        </w:rPr>
+        <w:t>THÔNG TIN QUY CÁCH BÀI VIẾT - dành cho khách hàng tham khảo, không đăng báo</w:t>
+      </w:r>
+    </w:p>
+    <w:tbl>
+      <w:tblPr>
+        <w:tblStyle w:val="TableGrid"/>
+        <w:tblW w:type="auto" w:w="0"/>
+        <w:tblLook w:firstColumn="1" w:firstRow="1" w:lastColumn="0" w:lastRow="0" w:noHBand="0" w:noVBand="1" w:val="04A0"/>
+      </w:tblPr>
+      <w:tblGrid>
+        <w:gridCol w:w="3120"/>
+        <w:gridCol w:w="3120"/>
+        <w:gridCol w:w="3120"/>
+      </w:tblGrid>
+      <w:tr>
+        <w:tc>
+          <w:tcPr>
+            <w:tcW w:type="dxa" w:w="2160"/>
+            <w:shd w:val="clear" w:color="auto" w:fill="D9E2F3"/>
+          </w:tcPr>
+          <w:p>
+            <w:r/>
+            <w:r>
+              <w:rPr>
+                <w:rFonts w:ascii="Inter" w:hAnsi="Inter"/>
+                <w:b/>
+                <w:i w:val="0"/>
+                <w:sz w:val="19"/>
+              </w:rPr>
+              <w:t>Tiêu chí</w:t>
+            </w:r>
+          </w:p>
+        </w:tc>
+        <w:tc>
+          <w:tcPr>
+            <w:tcW w:type="dxa" w:w="3168"/>
+            <w:shd w:val="clear" w:color="auto" w:fill="D9E2F3"/>
+          </w:tcPr>
+          <w:p>
+            <w:r/>
+            <w:r>
+              <w:rPr>
+                <w:rFonts w:ascii="Inter" w:hAnsi="Inter"/>
+                <w:b/>
+                <w:i w:val="0"/>
+                <w:sz w:val="19"/>
+              </w:rPr>
+              <w:t>Yêu cầu của báo</w:t>
+            </w:r>
+          </w:p>
+        </w:tc>
+        <w:tc>
+          <w:tcPr>
+            <w:tcW w:type="dxa" w:w="4032"/>
+            <w:shd w:val="clear" w:color="auto" w:fill="D9E2F3"/>
+          </w:tcPr>
+          <w:p>
+            <w:r/>
+            <w:r>
+              <w:rPr>
+                <w:rFonts w:ascii="Inter" w:hAnsi="Inter"/>
+                <w:b/>
+                <w:i w:val="0"/>
+                <w:sz w:val="19"/>
+              </w:rPr>
+              <w:t>Bài này</w:t>
+            </w:r>
+          </w:p>
+        </w:tc>
+      </w:tr>
+      <w:tr>
+        <w:tc>
+          <w:tcPr>
+            <w:tcW w:type="dxa" w:w="2160"/>
+          </w:tcPr>
+          <w:p>
+            <w:r/>
+            <w:r>
+              <w:rPr>
+                <w:rFonts w:ascii="Inter" w:hAnsi="Inter"/>
+                <w:b w:val="0"/>
+                <w:i w:val="0"/>
+                <w:sz w:val="19"/>
+              </w:rPr>
+              <w:t>Kênh đăng</w:t>
+            </w:r>
+          </w:p>
+        </w:tc>
+        <w:tc>
+          <w:tcPr>
+            <w:tcW w:type="dxa" w:w="3168"/>
+          </w:tcPr>
+          <w:p>
+            <w:r/>
+            <w:r>
+              <w:rPr>
+                <w:rFonts w:ascii="Inter" w:hAnsi="Inter"/>
+                <w:b w:val="0"/>
+                <w:i w:val="0"/>
+                <w:sz w:val="19"/>
+              </w:rPr>
+              <w:t>CafeBiz - bài thương hiệu</w:t>
+            </w:r>
+          </w:p>
+        </w:tc>
+        <w:tc>
+          <w:tcPr>
+            <w:tcW w:type="dxa" w:w="4032"/>
+          </w:tcPr>
+          <w:p>
+            <w:r/>
+            <w:r>
+              <w:rPr>
+                <w:rFonts w:ascii="Inter" w:hAnsi="Inter"/>
+                <w:b w:val="0"/>
+                <w:i w:val="0"/>
+                <w:sz w:val="19"/>
+              </w:rPr>
+              <w:t>CafeBiz</w:t>
+            </w:r>
+          </w:p>
+        </w:tc>
+      </w:tr>
+      <w:tr>
+        <w:tc>
+          <w:tcPr>
+            <w:tcW w:type="dxa" w:w="2160"/>
+          </w:tcPr>
+          <w:p>
+            <w:r/>
+            <w:r>
+              <w:rPr>
+                <w:rFonts w:ascii="Inter" w:hAnsi="Inter"/>
+                <w:b w:val="0"/>
+                <w:i w:val="0"/>
+                <w:sz w:val="19"/>
+              </w:rPr>
+              <w:t>Số ảnh</w:t>
+            </w:r>
+          </w:p>
+        </w:tc>
+        <w:tc>
+          <w:tcPr>
+            <w:tcW w:type="dxa" w:w="3168"/>
+          </w:tcPr>
+          <w:p>
+            <w:r/>
+            <w:r>
+              <w:rPr>
+                <w:rFonts w:ascii="Inter" w:hAnsi="Inter"/>
+                <w:b w:val="0"/>
+                <w:i w:val="0"/>
+                <w:sz w:val="19"/>
+              </w:rPr>
+              <w:t>Dưới 5 ảnh</w:t>
+            </w:r>
+          </w:p>
+        </w:tc>
+        <w:tc>
+          <w:tcPr>
+            <w:tcW w:type="dxa" w:w="4032"/>
+          </w:tcPr>
+          <w:p>
+            <w:r/>
+            <w:r>
+              <w:rPr>
+                <w:rFonts w:ascii="Inter" w:hAnsi="Inter"/>
+                <w:b w:val="0"/>
+                <w:i w:val="0"/>
+                <w:sz w:val="19"/>
+              </w:rPr>
+              <w:t>4 ảnh, có chú thích</w:t>
+            </w:r>
+          </w:p>
+        </w:tc>
+      </w:tr>
+      <w:tr>
+        <w:tc>
+          <w:tcPr>
+            <w:tcW w:type="dxa" w:w="2160"/>
+          </w:tcPr>
+          <w:p>
+            <w:r/>
+            <w:r>
+              <w:rPr>
+                <w:rFonts w:ascii="Inter" w:hAnsi="Inter"/>
+                <w:b w:val="0"/>
+                <w:i w:val="0"/>
+                <w:sz w:val="19"/>
+              </w:rPr>
+              <w:t>Số link</w:t>
+            </w:r>
+          </w:p>
+        </w:tc>
+        <w:tc>
+          <w:tcPr>
+            <w:tcW w:type="dxa" w:w="3168"/>
+          </w:tcPr>
+          <w:p>
+            <w:r/>
+            <w:r>
+              <w:rPr>
+                <w:rFonts w:ascii="Inter" w:hAnsi="Inter"/>
+                <w:b w:val="0"/>
+                <w:i w:val="0"/>
+                <w:sz w:val="19"/>
+              </w:rPr>
+              <w:t>1 link</w:t>
+            </w:r>
+          </w:p>
+        </w:tc>
+        <w:tc>
+          <w:tcPr>
+            <w:tcW w:type="dxa" w:w="4032"/>
+          </w:tcPr>
+          <w:p>
+            <w:r/>
+            <w:r>
+              <w:rPr>
+                <w:rFonts w:ascii="Inter" w:hAnsi="Inter"/>
+                <w:b w:val="0"/>
+                <w:i w:val="0"/>
+                <w:sz w:val="19"/>
+              </w:rPr>
+              <w:t>1 link: apconsulting.vn (cuối bài)</w:t>
+            </w:r>
+          </w:p>
+        </w:tc>
+      </w:tr>
+      <w:tr>
+        <w:tc>
+          <w:tcPr>
+            <w:tcW w:type="dxa" w:w="2160"/>
+          </w:tcPr>
+          <w:p>
+            <w:r/>
+            <w:r>
+              <w:rPr>
+                <w:rFonts w:ascii="Inter" w:hAnsi="Inter"/>
+                <w:b w:val="0"/>
+                <w:i w:val="0"/>
+                <w:sz w:val="19"/>
+              </w:rPr>
+              <w:t>Độ dài</w:t>
+            </w:r>
+          </w:p>
+        </w:tc>
+        <w:tc>
+          <w:tcPr>
+            <w:tcW w:type="dxa" w:w="3168"/>
+          </w:tcPr>
+          <w:p>
+            <w:r/>
+            <w:r>
+              <w:rPr>
+                <w:rFonts w:ascii="Inter" w:hAnsi="Inter"/>
+                <w:b w:val="0"/>
+                <w:i w:val="0"/>
+                <w:sz w:val="19"/>
+              </w:rPr>
+              <w:t>Khoảng 1.000 từ</w:t>
+            </w:r>
+          </w:p>
+        </w:tc>
+        <w:tc>
+          <w:tcPr>
+            <w:tcW w:type="dxa" w:w="4032"/>
+          </w:tcPr>
+          <w:p>
+            <w:r/>
+            <w:r>
+              <w:rPr>
+                <w:rFonts w:ascii="Inter" w:hAnsi="Inter"/>
+                <w:b w:val="0"/>
+                <w:i w:val="0"/>
+                <w:sz w:val="19"/>
+              </w:rPr>
+              <w:t>Khoảng 1.007 từ (tính cả sapo, không tính tiêu đề)</w:t>
+            </w:r>
+          </w:p>
+        </w:tc>
+      </w:tr>
+      <w:tr>
+        <w:tc>
+          <w:tcPr>
+            <w:tcW w:type="dxa" w:w="2160"/>
+          </w:tcPr>
+          <w:p>
+            <w:r/>
+            <w:r>
+              <w:rPr>
+                <w:rFonts w:ascii="Inter" w:hAnsi="Inter"/>
+                <w:b w:val="0"/>
+                <w:i w:val="0"/>
+                <w:sz w:val="19"/>
+              </w:rPr>
+              <w:t>Nội dung</w:t>
+            </w:r>
+          </w:p>
+        </w:tc>
+        <w:tc>
+          <w:tcPr>
+            <w:tcW w:type="dxa" w:w="3168"/>
+          </w:tcPr>
+          <w:p>
+            <w:r/>
+            <w:r>
+              <w:rPr>
+                <w:rFonts w:ascii="Inter" w:hAnsi="Inter"/>
+                <w:b w:val="0"/>
+                <w:i w:val="0"/>
+                <w:sz w:val="19"/>
+              </w:rPr>
+              <w:t>Đủ ý theo bài mẫu khách duyệt</w:t>
+            </w:r>
+          </w:p>
+        </w:tc>
+        <w:tc>
+          <w:tcPr>
+            <w:tcW w:type="dxa" w:w="4032"/>
+          </w:tcPr>
+          <w:p>
+            <w:r/>
+            <w:r>
+              <w:rPr>
+                <w:rFonts w:ascii="Inter" w:hAnsi="Inter"/>
+                <w:b w:val="0"/>
+                <w:i w:val="0"/>
+                <w:sz w:val="19"/>
+              </w:rPr>
+              <w:t>Giữ nguyên toàn bộ ý, số liệu và trích dẫn của bài mẫu</w:t>
+            </w:r>
+          </w:p>
+        </w:tc>
+      </w:tr>
+    </w:tbl>
+    <w:p>
+      <w:r>
+        <w:rPr>
+          <w:rFonts w:ascii="Inter" w:hAnsi="Inter"/>
+          <w:b w:val="0"/>
+          <w:i/>
+          <w:sz w:val="19"/>
+        </w:rPr>
+        <w:t>Phần dưới đây là nội dung bài đăng.</w:t>
+      </w:r>
+    </w:p>
+    <w:p>
+      <w:pPr>
+        <w:spacing w:after="280"/>
+        <w:pBdr>
+          <w:bottom w:val="single" w:sz="8" w:space="1" w:color="808080"/>
+        </w:pBdr>
+      </w:pPr>
+    </w:p>
     <w:p>
       <w:r>
         <w:rPr>

</xml_diff>